<commit_message>
Useful data for a CV.
</commit_message>
<xml_diff>
--- a/07_Published_Content/01_LinkedIn/CV_Mauro_Presso_Sr_Software_Developer_Backend Template.docx
+++ b/07_Published_Content/01_LinkedIn/CV_Mauro_Presso_Sr_Software_Developer_Backend Template.docx
@@ -4,13 +4,13 @@
   <w:body>
     <w:tbl>
       <w:tblPr>
-        <w:tblW w:w="4821" w:type="pct"/>
-        <w:tblInd w:w="270" w:type="dxa"/>
+        <w:tblW w:w="9720" w:type="dxa"/>
+        <w:tblInd w:w="1066" w:type="dxa"/>
         <w:tblLayout w:type="fixed"/>
         <w:tblLook w:val="0600" w:firstRow="0" w:lastRow="0" w:firstColumn="0" w:lastColumn="0" w:noHBand="1" w:noVBand="1"/>
       </w:tblPr>
       <w:tblGrid>
-        <w:gridCol w:w="9719"/>
+        <w:gridCol w:w="9720"/>
       </w:tblGrid>
       <w:tr>
         <w:trPr>
@@ -18,10 +18,11 @@
         </w:trPr>
         <w:tc>
           <w:tcPr>
-            <w:tcW w:w="9719" w:type="dxa"/>
+            <w:tcW w:w="11246" w:type="dxa"/>
           </w:tcPr>
           <w:p>
             <w:pPr>
+              <w:spacing w:after="40"/>
               <w:jc w:val="center"/>
             </w:pPr>
           </w:p>
@@ -30,7 +31,7 @@
       <w:tr>
         <w:tc>
           <w:tcPr>
-            <w:tcW w:w="9719" w:type="dxa"/>
+            <w:tcW w:w="11246" w:type="dxa"/>
             <w:tcMar>
               <w:top w:w="0" w:type="dxa"/>
               <w:left w:w="0" w:type="dxa"/>
@@ -201,19 +202,22 @@
       </w:tr>
       <w:tr>
         <w:trPr>
-          <w:trHeight w:val="1958"/>
+          <w:trHeight w:val="1602"/>
         </w:trPr>
         <w:tc>
           <w:tcPr>
-            <w:tcW w:w="9719" w:type="dxa"/>
+            <w:tcW w:w="11246" w:type="dxa"/>
           </w:tcPr>
           <w:p/>
         </w:tc>
       </w:tr>
       <w:tr>
+        <w:trPr>
+          <w:trHeight w:val="68"/>
+        </w:trPr>
         <w:tc>
           <w:tcPr>
-            <w:tcW w:w="9719" w:type="dxa"/>
+            <w:tcW w:w="11246" w:type="dxa"/>
             <w:tcMar>
               <w:top w:w="0" w:type="dxa"/>
               <w:left w:w="0" w:type="dxa"/>
@@ -224,10 +228,25 @@
           <w:p/>
         </w:tc>
       </w:tr>
+    </w:tbl>
+    <w:p/>
+    <w:tbl>
+      <w:tblPr>
+        <w:tblW w:w="11664" w:type="dxa"/>
+        <w:tblLayout w:type="fixed"/>
+        <w:tblCellMar>
+          <w:top w:w="72" w:type="dxa"/>
+          <w:bottom w:w="72" w:type="dxa"/>
+        </w:tblCellMar>
+        <w:tblLook w:val="0600" w:firstRow="0" w:lastRow="0" w:firstColumn="0" w:lastColumn="0" w:noHBand="1" w:noVBand="1"/>
+      </w:tblPr>
+      <w:tblGrid>
+        <w:gridCol w:w="11664"/>
+      </w:tblGrid>
       <w:tr>
         <w:tc>
           <w:tcPr>
-            <w:tcW w:w="9719" w:type="dxa"/>
+            <w:tcW w:w="11246" w:type="dxa"/>
             <w:tcMar>
               <w:top w:w="0" w:type="dxa"/>
               <w:left w:w="0" w:type="dxa"/>
@@ -239,24 +258,34 @@
           <w:p>
             <w:pPr>
               <w:pStyle w:val="Heading1"/>
+              <w:keepNext w:val="0"/>
+              <w:keepLines w:val="0"/>
+              <w:rPr>
+                <w:sz w:val="22"/>
+                <w:szCs w:val="22"/>
+              </w:rPr>
             </w:pPr>
             <w:r>
               <w:rPr>
                 <w:rStyle w:val="Triangle"/>
+                <w:sz w:val="22"/>
+                <w:szCs w:val="22"/>
               </w:rPr>
               <w:t>▼</w:t>
             </w:r>
             <w:r>
-              <w:t xml:space="preserve"> </w:t>
-            </w:r>
-            <w:r>
-              <w:t>Objective</w:t>
+              <w:rPr>
+                <w:sz w:val="22"/>
+                <w:szCs w:val="22"/>
+              </w:rPr>
+              <w:t xml:space="preserve"> Objective</w:t>
             </w:r>
           </w:p>
           <w:sdt>
             <w:sdtPr>
               <w:rPr>
-                <w:sz w:val="24"/>
+                <w:sz w:val="22"/>
+                <w:szCs w:val="22"/>
               </w:rPr>
               <w:id w:val="-1770999765"/>
               <w:placeholder>
@@ -269,13 +298,15 @@
             <w:sdtEndPr>
               <w:rPr>
                 <w:sz w:val="16"/>
+                <w:szCs w:val="24"/>
               </w:rPr>
             </w:sdtEndPr>
             <w:sdtContent>
               <w:p>
                 <w:r>
                   <w:rPr>
-                    <w:sz w:val="24"/>
+                    <w:sz w:val="22"/>
+                    <w:szCs w:val="22"/>
                   </w:rPr>
                   <w:t>[Replace this sentence with your job objective. To replace any tip text with your own, just select a line of text and start typing. For best results when selecting text to copy or replace, don’t include space to the right of the characters in your selection.]</w:t>
                 </w:r>
@@ -287,7 +318,7 @@
       <w:tr>
         <w:tc>
           <w:tcPr>
-            <w:tcW w:w="9719" w:type="dxa"/>
+            <w:tcW w:w="11246" w:type="dxa"/>
             <w:tcMar>
               <w:top w:w="0" w:type="dxa"/>
               <w:left w:w="0" w:type="dxa"/>
@@ -298,6 +329,8 @@
           <w:p>
             <w:pPr>
               <w:pStyle w:val="Heading1"/>
+              <w:keepNext w:val="0"/>
+              <w:keepLines w:val="0"/>
             </w:pPr>
             <w:r>
               <w:rPr>
@@ -315,9 +348,15 @@
           <w:p>
             <w:pPr>
               <w:pStyle w:val="Dates"/>
+              <w:rPr>
+                <w:szCs w:val="16"/>
+              </w:rPr>
             </w:pPr>
             <w:sdt>
               <w:sdtPr>
+                <w:rPr>
+                  <w:szCs w:val="16"/>
+                </w:rPr>
                 <w:id w:val="201059472"/>
                 <w:placeholder>
                   <w:docPart w:val="D21D8E7F739C47B98469529F8D61BA22"/>
@@ -328,15 +367,24 @@
               </w:sdtPr>
               <w:sdtContent>
                 <w:r>
+                  <w:rPr>
+                    <w:szCs w:val="16"/>
+                  </w:rPr>
                   <w:t>[Dates From]</w:t>
                 </w:r>
               </w:sdtContent>
             </w:sdt>
             <w:r>
+              <w:rPr>
+                <w:szCs w:val="16"/>
+              </w:rPr>
               <w:t>–</w:t>
             </w:r>
             <w:sdt>
               <w:sdtPr>
+                <w:rPr>
+                  <w:szCs w:val="16"/>
+                </w:rPr>
                 <w:id w:val="-1419934752"/>
                 <w:placeholder>
                   <w:docPart w:val="D4F9CD2CC24D42EE9066D3967A0D98F4"/>
@@ -347,6 +395,9 @@
               </w:sdtPr>
               <w:sdtContent>
                 <w:r>
+                  <w:rPr>
+                    <w:szCs w:val="16"/>
+                  </w:rPr>
                   <w:t>[To]</w:t>
                 </w:r>
               </w:sdtContent>
@@ -355,9 +406,15 @@
           <w:p>
             <w:pPr>
               <w:pStyle w:val="Experience"/>
+              <w:rPr>
+                <w:szCs w:val="16"/>
+              </w:rPr>
             </w:pPr>
             <w:sdt>
               <w:sdtPr>
+                <w:rPr>
+                  <w:szCs w:val="16"/>
+                </w:rPr>
                 <w:id w:val="-1167319978"/>
                 <w:placeholder>
                   <w:docPart w:val="F9386B3480E04E3290E10D64633E6D7B"/>
@@ -376,6 +433,9 @@
               </w:sdtEndPr>
               <w:sdtContent>
                 <w:r>
+                  <w:rPr>
+                    <w:szCs w:val="16"/>
+                  </w:rPr>
                   <w:t>[Job Title]</w:t>
                 </w:r>
               </w:sdtContent>
@@ -383,14 +443,21 @@
             <w:r>
               <w:rPr>
                 <w:rStyle w:val="Strong"/>
+                <w:szCs w:val="16"/>
               </w:rPr>
               <w:t>•</w:t>
             </w:r>
             <w:r>
+              <w:rPr>
+                <w:szCs w:val="16"/>
+              </w:rPr>
               <w:t xml:space="preserve"> </w:t>
             </w:r>
             <w:sdt>
               <w:sdtPr>
+                <w:rPr>
+                  <w:szCs w:val="16"/>
+                </w:rPr>
                 <w:id w:val="2029511879"/>
                 <w:placeholder>
                   <w:docPart w:val="DAE88309AA69441EB9A47F1C112DE6C0"/>
@@ -401,24 +468,37 @@
               </w:sdtPr>
               <w:sdtContent>
                 <w:r>
+                  <w:rPr>
+                    <w:szCs w:val="16"/>
+                  </w:rPr>
                   <w:t>[Job Position]</w:t>
                 </w:r>
               </w:sdtContent>
             </w:sdt>
             <w:r>
+              <w:rPr>
+                <w:szCs w:val="16"/>
+              </w:rPr>
               <w:t xml:space="preserve"> </w:t>
             </w:r>
             <w:r>
               <w:rPr>
                 <w:rStyle w:val="Strong"/>
+                <w:szCs w:val="16"/>
               </w:rPr>
               <w:t>•</w:t>
             </w:r>
             <w:r>
+              <w:rPr>
+                <w:szCs w:val="16"/>
+              </w:rPr>
               <w:t xml:space="preserve"> </w:t>
             </w:r>
             <w:sdt>
               <w:sdtPr>
+                <w:rPr>
+                  <w:szCs w:val="16"/>
+                </w:rPr>
                 <w:id w:val="-1315797015"/>
                 <w:placeholder>
                   <w:docPart w:val="FC5A1A691B01438DAE646E82F861809B"/>
@@ -429,6 +509,9 @@
               </w:sdtPr>
               <w:sdtContent>
                 <w:r>
+                  <w:rPr>
+                    <w:szCs w:val="16"/>
+                  </w:rPr>
                   <w:t>[Company Name]</w:t>
                 </w:r>
               </w:sdtContent>
@@ -437,9 +520,15 @@
           <w:p>
             <w:pPr>
               <w:pStyle w:val="Dates"/>
+              <w:rPr>
+                <w:szCs w:val="16"/>
+              </w:rPr>
             </w:pPr>
             <w:sdt>
               <w:sdtPr>
+                <w:rPr>
+                  <w:szCs w:val="16"/>
+                </w:rPr>
                 <w:id w:val="1889063361"/>
                 <w:placeholder>
                   <w:docPart w:val="326EB73F17A84CCFB8079F2F6C37C0D3"/>
@@ -450,15 +539,24 @@
               </w:sdtPr>
               <w:sdtContent>
                 <w:r>
+                  <w:rPr>
+                    <w:szCs w:val="16"/>
+                  </w:rPr>
                   <w:t>[Dates From]</w:t>
                 </w:r>
               </w:sdtContent>
             </w:sdt>
             <w:r>
+              <w:rPr>
+                <w:szCs w:val="16"/>
+              </w:rPr>
               <w:t>–</w:t>
             </w:r>
             <w:sdt>
               <w:sdtPr>
+                <w:rPr>
+                  <w:szCs w:val="16"/>
+                </w:rPr>
                 <w:id w:val="1060751496"/>
                 <w:placeholder>
                   <w:docPart w:val="A3D7937CE10845A3B9277A84F61AB563"/>
@@ -469,6 +567,9 @@
               </w:sdtPr>
               <w:sdtContent>
                 <w:r>
+                  <w:rPr>
+                    <w:szCs w:val="16"/>
+                  </w:rPr>
                   <w:t>[To]</w:t>
                 </w:r>
               </w:sdtContent>
@@ -477,9 +578,15 @@
           <w:p>
             <w:pPr>
               <w:pStyle w:val="Experience"/>
+              <w:rPr>
+                <w:szCs w:val="16"/>
+              </w:rPr>
             </w:pPr>
             <w:sdt>
               <w:sdtPr>
+                <w:rPr>
+                  <w:szCs w:val="16"/>
+                </w:rPr>
                 <w:id w:val="2089416168"/>
                 <w:placeholder>
                   <w:docPart w:val="83CDF7FF707140FF81CBEF91554B2782"/>
@@ -498,6 +605,9 @@
               </w:sdtEndPr>
               <w:sdtContent>
                 <w:r>
+                  <w:rPr>
+                    <w:szCs w:val="16"/>
+                  </w:rPr>
                   <w:t>[Job Title]</w:t>
                 </w:r>
               </w:sdtContent>
@@ -505,14 +615,21 @@
             <w:r>
               <w:rPr>
                 <w:rStyle w:val="Strong"/>
+                <w:szCs w:val="16"/>
               </w:rPr>
               <w:t>•</w:t>
             </w:r>
             <w:r>
+              <w:rPr>
+                <w:szCs w:val="16"/>
+              </w:rPr>
               <w:t xml:space="preserve"> </w:t>
             </w:r>
             <w:sdt>
               <w:sdtPr>
+                <w:rPr>
+                  <w:szCs w:val="16"/>
+                </w:rPr>
                 <w:id w:val="578792993"/>
                 <w:placeholder>
                   <w:docPart w:val="9268FD0C722A481CA754019E9DEA5BFB"/>
@@ -523,24 +640,37 @@
               </w:sdtPr>
               <w:sdtContent>
                 <w:r>
+                  <w:rPr>
+                    <w:szCs w:val="16"/>
+                  </w:rPr>
                   <w:t>[Job Position]</w:t>
                 </w:r>
               </w:sdtContent>
             </w:sdt>
             <w:r>
+              <w:rPr>
+                <w:szCs w:val="16"/>
+              </w:rPr>
               <w:t xml:space="preserve"> </w:t>
             </w:r>
             <w:r>
               <w:rPr>
                 <w:rStyle w:val="Strong"/>
+                <w:szCs w:val="16"/>
               </w:rPr>
               <w:t>•</w:t>
             </w:r>
             <w:r>
+              <w:rPr>
+                <w:szCs w:val="16"/>
+              </w:rPr>
               <w:t xml:space="preserve"> </w:t>
             </w:r>
             <w:sdt>
               <w:sdtPr>
+                <w:rPr>
+                  <w:szCs w:val="16"/>
+                </w:rPr>
                 <w:id w:val="-1847401369"/>
                 <w:placeholder>
                   <w:docPart w:val="B7AF74C5FA6E4CC78E33BCC55893B4D8"/>
@@ -551,6 +681,9 @@
               </w:sdtPr>
               <w:sdtContent>
                 <w:r>
+                  <w:rPr>
+                    <w:szCs w:val="16"/>
+                  </w:rPr>
                   <w:t>[Company Name]</w:t>
                 </w:r>
               </w:sdtContent>
@@ -559,9 +692,15 @@
           <w:p>
             <w:pPr>
               <w:pStyle w:val="Dates"/>
+              <w:rPr>
+                <w:szCs w:val="16"/>
+              </w:rPr>
             </w:pPr>
             <w:sdt>
               <w:sdtPr>
+                <w:rPr>
+                  <w:szCs w:val="16"/>
+                </w:rPr>
                 <w:id w:val="-848477920"/>
                 <w:placeholder>
                   <w:docPart w:val="68AD57AD34A74EBC90E06169A68D36C0"/>
@@ -572,15 +711,24 @@
               </w:sdtPr>
               <w:sdtContent>
                 <w:r>
+                  <w:rPr>
+                    <w:szCs w:val="16"/>
+                  </w:rPr>
                   <w:t>[Dates From]</w:t>
                 </w:r>
               </w:sdtContent>
             </w:sdt>
             <w:r>
+              <w:rPr>
+                <w:szCs w:val="16"/>
+              </w:rPr>
               <w:t>–</w:t>
             </w:r>
             <w:sdt>
               <w:sdtPr>
+                <w:rPr>
+                  <w:szCs w:val="16"/>
+                </w:rPr>
                 <w:id w:val="-1252506306"/>
                 <w:placeholder>
                   <w:docPart w:val="B820F1C392D3435A98F193F951E74A59"/>
@@ -591,6 +739,9 @@
               </w:sdtPr>
               <w:sdtContent>
                 <w:r>
+                  <w:rPr>
+                    <w:szCs w:val="16"/>
+                  </w:rPr>
                   <w:t>[To]</w:t>
                 </w:r>
               </w:sdtContent>
@@ -599,9 +750,15 @@
           <w:p>
             <w:pPr>
               <w:pStyle w:val="Experience"/>
+              <w:rPr>
+                <w:szCs w:val="16"/>
+              </w:rPr>
             </w:pPr>
             <w:sdt>
               <w:sdtPr>
+                <w:rPr>
+                  <w:szCs w:val="16"/>
+                </w:rPr>
                 <w:id w:val="-1462188416"/>
                 <w:placeholder>
                   <w:docPart w:val="AAB9C766DAC24988B8F09748B36DCD1B"/>
@@ -620,6 +777,9 @@
               </w:sdtEndPr>
               <w:sdtContent>
                 <w:r>
+                  <w:rPr>
+                    <w:szCs w:val="16"/>
+                  </w:rPr>
                   <w:t>[Job Title]</w:t>
                 </w:r>
               </w:sdtContent>
@@ -627,14 +787,21 @@
             <w:r>
               <w:rPr>
                 <w:rStyle w:val="Strong"/>
+                <w:szCs w:val="16"/>
               </w:rPr>
               <w:t>•</w:t>
             </w:r>
             <w:r>
+              <w:rPr>
+                <w:szCs w:val="16"/>
+              </w:rPr>
               <w:t xml:space="preserve"> </w:t>
             </w:r>
             <w:sdt>
               <w:sdtPr>
+                <w:rPr>
+                  <w:szCs w:val="16"/>
+                </w:rPr>
                 <w:id w:val="-1768142880"/>
                 <w:placeholder>
                   <w:docPart w:val="8091687489E9470691B3C08C66D124DE"/>
@@ -645,24 +812,37 @@
               </w:sdtPr>
               <w:sdtContent>
                 <w:r>
+                  <w:rPr>
+                    <w:szCs w:val="16"/>
+                  </w:rPr>
                   <w:t>[Job Position]</w:t>
                 </w:r>
               </w:sdtContent>
             </w:sdt>
             <w:r>
+              <w:rPr>
+                <w:szCs w:val="16"/>
+              </w:rPr>
               <w:t xml:space="preserve"> </w:t>
             </w:r>
             <w:r>
               <w:rPr>
                 <w:rStyle w:val="Strong"/>
+                <w:szCs w:val="16"/>
               </w:rPr>
               <w:t>•</w:t>
             </w:r>
             <w:r>
+              <w:rPr>
+                <w:szCs w:val="16"/>
+              </w:rPr>
               <w:t xml:space="preserve"> </w:t>
             </w:r>
             <w:sdt>
               <w:sdtPr>
+                <w:rPr>
+                  <w:szCs w:val="16"/>
+                </w:rPr>
                 <w:id w:val="-1452551456"/>
                 <w:placeholder>
                   <w:docPart w:val="A3C2B69F1A96445A8BDAD915290694C9"/>
@@ -673,6 +853,9 @@
               </w:sdtPr>
               <w:sdtContent>
                 <w:r>
+                  <w:rPr>
+                    <w:szCs w:val="16"/>
+                  </w:rPr>
                   <w:t>[Company Name]</w:t>
                 </w:r>
               </w:sdtContent>
@@ -680,6 +863,9 @@
           </w:p>
           <w:sdt>
             <w:sdtPr>
+              <w:rPr>
+                <w:szCs w:val="16"/>
+              </w:rPr>
               <w:id w:val="-770157231"/>
               <w:placeholder>
                 <w:docPart w:val="7631F2D0863A4007978D6EB169D8E878"/>
@@ -688,12 +874,23 @@
               <w:showingPlcHdr/>
               <w15:appearance w15:val="hidden"/>
             </w:sdtPr>
+            <w:sdtEndPr>
+              <w:rPr>
+                <w:szCs w:val="24"/>
+              </w:rPr>
+            </w:sdtEndPr>
             <w:sdtContent>
               <w:p>
                 <w:r>
+                  <w:rPr>
+                    <w:szCs w:val="16"/>
+                  </w:rPr>
                   <w:t>[This is the place for a brief summary of your key responsibilities and most stellar</w:t>
                 </w:r>
                 <w:r>
+                  <w:rPr>
+                    <w:szCs w:val="16"/>
+                  </w:rPr>
                   <w:br/>
                   <w:t>accomplishments.]</w:t>
                 </w:r>
@@ -705,7 +902,7 @@
       <w:tr>
         <w:tc>
           <w:tcPr>
-            <w:tcW w:w="9719" w:type="dxa"/>
+            <w:tcW w:w="11246" w:type="dxa"/>
             <w:tcMar>
               <w:top w:w="0" w:type="dxa"/>
               <w:left w:w="0" w:type="dxa"/>
@@ -716,6 +913,8 @@
           <w:p>
             <w:pPr>
               <w:pStyle w:val="Heading1"/>
+              <w:keepNext w:val="0"/>
+              <w:keepLines w:val="0"/>
             </w:pPr>
             <w:r>
               <w:rPr>
@@ -807,9 +1006,12 @@
         </w:tc>
       </w:tr>
       <w:tr>
+        <w:trPr>
+          <w:trHeight w:val="1341"/>
+        </w:trPr>
         <w:tc>
           <w:tcPr>
-            <w:tcW w:w="9719" w:type="dxa"/>
+            <w:tcW w:w="11246" w:type="dxa"/>
             <w:tcMar>
               <w:top w:w="0" w:type="dxa"/>
               <w:left w:w="0" w:type="dxa"/>
@@ -820,6 +1022,8 @@
           <w:p>
             <w:pPr>
               <w:pStyle w:val="Heading1"/>
+              <w:keepNext w:val="0"/>
+              <w:keepLines w:val="0"/>
             </w:pPr>
             <w:r>
               <w:rPr>
@@ -865,7 +1069,7 @@
       <w:tr>
         <w:tc>
           <w:tcPr>
-            <w:tcW w:w="9719" w:type="dxa"/>
+            <w:tcW w:w="11246" w:type="dxa"/>
             <w:tcMar>
               <w:top w:w="0" w:type="dxa"/>
               <w:left w:w="0" w:type="dxa"/>
@@ -876,6 +1080,8 @@
           <w:p>
             <w:pPr>
               <w:pStyle w:val="Heading1"/>
+              <w:keepNext w:val="0"/>
+              <w:keepLines w:val="0"/>
             </w:pPr>
             <w:r>
               <w:rPr>
@@ -924,9 +1130,12 @@
         </w:tc>
       </w:tr>
       <w:tr>
+        <w:trPr>
+          <w:trHeight w:val="2511"/>
+        </w:trPr>
         <w:tc>
           <w:tcPr>
-            <w:tcW w:w="9719" w:type="dxa"/>
+            <w:tcW w:w="11246" w:type="dxa"/>
             <w:tcMar>
               <w:top w:w="0" w:type="dxa"/>
               <w:left w:w="0" w:type="dxa"/>
@@ -937,6 +1146,8 @@
           <w:p>
             <w:pPr>
               <w:pStyle w:val="Heading1"/>
+              <w:keepNext w:val="0"/>
+              <w:keepLines w:val="0"/>
             </w:pPr>
             <w:r>
               <w:rPr>
@@ -980,20 +1191,17 @@
     <w:p>
       <w:pPr>
         <w:rPr>
-          <w:sz w:val="24"/>
+          <w:sz w:val="2"/>
+          <w:szCs w:val="2"/>
           <w:lang w:val="es-AR"/>
         </w:rPr>
       </w:pPr>
     </w:p>
     <w:sectPr>
-      <w:headerReference w:type="even" r:id="rId14"/>
-      <w:headerReference w:type="default" r:id="rId15"/>
-      <w:footerReference w:type="even" r:id="rId16"/>
-      <w:footerReference w:type="default" r:id="rId17"/>
-      <w:headerReference w:type="first" r:id="rId18"/>
-      <w:footerReference w:type="first" r:id="rId19"/>
+      <w:headerReference w:type="default" r:id="rId14"/>
+      <w:footerReference w:type="default" r:id="rId15"/>
       <w:pgSz w:w="12240" w:h="15840" w:code="1"/>
-      <w:pgMar w:top="850" w:right="1080" w:bottom="810" w:left="1080" w:header="720" w:footer="432" w:gutter="0"/>
+      <w:pgMar w:top="288" w:right="288" w:bottom="288" w:left="288" w:header="720" w:footer="432" w:gutter="0"/>
       <w:cols w:space="708"/>
       <w:docGrid w:linePitch="360"/>
     </w:sectPr>
@@ -1021,16 +1229,6 @@
 </file>
 
 <file path=word/footer1.xml><?xml version="1.0" encoding="utf-8"?>
-<w:ftr xmlns:wpc="http://schemas.microsoft.com/office/word/2010/wordprocessingCanvas" xmlns:cx="http://schemas.microsoft.com/office/drawing/2014/chartex" xmlns:cx1="http://schemas.microsoft.com/office/drawing/2015/9/8/chartex" xmlns:cx2="http://schemas.microsoft.com/office/drawing/2015/10/21/chartex" xmlns:cx3="http://schemas.microsoft.com/office/drawing/2016/5/9/chartex" xmlns:cx4="http://schemas.microsoft.com/office/drawing/2016/5/10/chartex" xmlns:cx5="http://schemas.microsoft.com/office/drawing/2016/5/11/chartex" xmlns:cx6="http://schemas.microsoft.com/office/drawing/2016/5/12/chartex" xmlns:cx7="http://schemas.microsoft.com/office/drawing/2016/5/13/chartex" xmlns:cx8="http://schemas.microsoft.com/office/drawing/2016/5/14/chartex" xmlns:mc="http://schemas.openxmlformats.org/markup-compatibility/2006" xmlns:aink="http://schemas.microsoft.com/office/drawing/2016/ink" xmlns:am3d="http://schemas.microsoft.com/office/drawing/2017/model3d" xmlns:o="urn:schemas-microsoft-com:office:office" xmlns:oel="http://schemas.microsoft.com/office/2019/extlst" xmlns:r="http://schemas.openxmlformats.org/officeDocument/2006/relationships" xmlns:m="http://schemas.openxmlformats.org/officeDocument/2006/math" xmlns:v="urn:schemas-microsoft-com:vml" xmlns:wp14="http://schemas.microsoft.com/office/word/2010/wordprocessingDrawing" xmlns:wp="http://schemas.openxmlformats.org/drawingml/2006/wordprocessingDrawing" xmlns:w10="urn:schemas-microsoft-com:office:word" xmlns:w="http://schemas.openxmlformats.org/wordprocessingml/2006/main" xmlns:w14="http://schemas.microsoft.com/office/word/2010/wordml" xmlns:w15="http://schemas.microsoft.com/office/word/2012/wordml" xmlns:w16cex="http://schemas.microsoft.com/office/word/2018/wordml/cex" xmlns:w16cid="http://schemas.microsoft.com/office/word/2016/wordml/cid" xmlns:w16="http://schemas.microsoft.com/office/word/2018/wordml" xmlns:w16du="http://schemas.microsoft.com/office/word/2023/wordml/word16du" xmlns:w16sdtdh="http://schemas.microsoft.com/office/word/2020/wordml/sdtdatahash" xmlns:w16sdtfl="http://schemas.microsoft.com/office/word/2024/wordml/sdtformatlock" xmlns:w16se="http://schemas.microsoft.com/office/word/2015/wordml/symex" xmlns:wpg="http://schemas.microsoft.com/office/word/2010/wordprocessingGroup" xmlns:wpi="http://schemas.microsoft.com/office/word/2010/wordprocessingInk" xmlns:wne="http://schemas.microsoft.com/office/word/2006/wordml" xmlns:wps="http://schemas.microsoft.com/office/word/2010/wordprocessingShape" mc:Ignorable="w14 w15 w16se w16cid w16 w16cex w16sdtdh w16sdtfl w16du wp14">
-  <w:p>
-    <w:pPr>
-      <w:pStyle w:val="Footer"/>
-    </w:pPr>
-  </w:p>
-</w:ftr>
-</file>
-
-<file path=word/footer2.xml><?xml version="1.0" encoding="utf-8"?>
 <w:ftr xmlns:wpc="http://schemas.microsoft.com/office/word/2010/wordprocessingCanvas" xmlns:cx="http://schemas.microsoft.com/office/drawing/2014/chartex" xmlns:cx1="http://schemas.microsoft.com/office/drawing/2015/9/8/chartex" xmlns:cx2="http://schemas.microsoft.com/office/drawing/2015/10/21/chartex" xmlns:cx3="http://schemas.microsoft.com/office/drawing/2016/5/9/chartex" xmlns:cx4="http://schemas.microsoft.com/office/drawing/2016/5/10/chartex" xmlns:cx5="http://schemas.microsoft.com/office/drawing/2016/5/11/chartex" xmlns:cx6="http://schemas.microsoft.com/office/drawing/2016/5/12/chartex" xmlns:cx7="http://schemas.microsoft.com/office/drawing/2016/5/13/chartex" xmlns:cx8="http://schemas.microsoft.com/office/drawing/2016/5/14/chartex" xmlns:mc="http://schemas.openxmlformats.org/markup-compatibility/2006" xmlns:aink="http://schemas.microsoft.com/office/drawing/2016/ink" xmlns:am3d="http://schemas.microsoft.com/office/drawing/2017/model3d" xmlns:o="urn:schemas-microsoft-com:office:office" xmlns:oel="http://schemas.microsoft.com/office/2019/extlst" xmlns:r="http://schemas.openxmlformats.org/officeDocument/2006/relationships" xmlns:m="http://schemas.openxmlformats.org/officeDocument/2006/math" xmlns:v="urn:schemas-microsoft-com:vml" xmlns:wp14="http://schemas.microsoft.com/office/word/2010/wordprocessingDrawing" xmlns:wp="http://schemas.openxmlformats.org/drawingml/2006/wordprocessingDrawing" xmlns:w10="urn:schemas-microsoft-com:office:word" xmlns:w="http://schemas.openxmlformats.org/wordprocessingml/2006/main" xmlns:w14="http://schemas.microsoft.com/office/word/2010/wordml" xmlns:w15="http://schemas.microsoft.com/office/word/2012/wordml" xmlns:w16cex="http://schemas.microsoft.com/office/word/2018/wordml/cex" xmlns:w16cid="http://schemas.microsoft.com/office/word/2016/wordml/cid" xmlns:w16="http://schemas.microsoft.com/office/word/2018/wordml" xmlns:w16du="http://schemas.microsoft.com/office/word/2023/wordml/word16du" xmlns:w16sdtdh="http://schemas.microsoft.com/office/word/2020/wordml/sdtdatahash" xmlns:w16sdtfl="http://schemas.microsoft.com/office/word/2024/wordml/sdtformatlock" xmlns:w16se="http://schemas.microsoft.com/office/word/2015/wordml/symex" xmlns:wpg="http://schemas.microsoft.com/office/word/2010/wordprocessingGroup" xmlns:wpi="http://schemas.microsoft.com/office/word/2010/wordprocessingInk" xmlns:wne="http://schemas.microsoft.com/office/word/2006/wordml" xmlns:wps="http://schemas.microsoft.com/office/word/2010/wordprocessingShape" mc:Ignorable="w14 w15 w16se w16cid w16 w16cex w16sdtdh w16sdtfl w16du wp14">
   <w:p>
     <w:pPr>
@@ -1159,16 +1357,6 @@
 </w:ftr>
 </file>
 
-<file path=word/footer3.xml><?xml version="1.0" encoding="utf-8"?>
-<w:ftr xmlns:wpc="http://schemas.microsoft.com/office/word/2010/wordprocessingCanvas" xmlns:cx="http://schemas.microsoft.com/office/drawing/2014/chartex" xmlns:cx1="http://schemas.microsoft.com/office/drawing/2015/9/8/chartex" xmlns:cx2="http://schemas.microsoft.com/office/drawing/2015/10/21/chartex" xmlns:cx3="http://schemas.microsoft.com/office/drawing/2016/5/9/chartex" xmlns:cx4="http://schemas.microsoft.com/office/drawing/2016/5/10/chartex" xmlns:cx5="http://schemas.microsoft.com/office/drawing/2016/5/11/chartex" xmlns:cx6="http://schemas.microsoft.com/office/drawing/2016/5/12/chartex" xmlns:cx7="http://schemas.microsoft.com/office/drawing/2016/5/13/chartex" xmlns:cx8="http://schemas.microsoft.com/office/drawing/2016/5/14/chartex" xmlns:mc="http://schemas.openxmlformats.org/markup-compatibility/2006" xmlns:aink="http://schemas.microsoft.com/office/drawing/2016/ink" xmlns:am3d="http://schemas.microsoft.com/office/drawing/2017/model3d" xmlns:o="urn:schemas-microsoft-com:office:office" xmlns:oel="http://schemas.microsoft.com/office/2019/extlst" xmlns:r="http://schemas.openxmlformats.org/officeDocument/2006/relationships" xmlns:m="http://schemas.openxmlformats.org/officeDocument/2006/math" xmlns:v="urn:schemas-microsoft-com:vml" xmlns:wp14="http://schemas.microsoft.com/office/word/2010/wordprocessingDrawing" xmlns:wp="http://schemas.openxmlformats.org/drawingml/2006/wordprocessingDrawing" xmlns:w10="urn:schemas-microsoft-com:office:word" xmlns:w="http://schemas.openxmlformats.org/wordprocessingml/2006/main" xmlns:w14="http://schemas.microsoft.com/office/word/2010/wordml" xmlns:w15="http://schemas.microsoft.com/office/word/2012/wordml" xmlns:w16cex="http://schemas.microsoft.com/office/word/2018/wordml/cex" xmlns:w16cid="http://schemas.microsoft.com/office/word/2016/wordml/cid" xmlns:w16="http://schemas.microsoft.com/office/word/2018/wordml" xmlns:w16du="http://schemas.microsoft.com/office/word/2023/wordml/word16du" xmlns:w16sdtdh="http://schemas.microsoft.com/office/word/2020/wordml/sdtdatahash" xmlns:w16sdtfl="http://schemas.microsoft.com/office/word/2024/wordml/sdtformatlock" xmlns:w16se="http://schemas.microsoft.com/office/word/2015/wordml/symex" xmlns:wpg="http://schemas.microsoft.com/office/word/2010/wordprocessingGroup" xmlns:wpi="http://schemas.microsoft.com/office/word/2010/wordprocessingInk" xmlns:wne="http://schemas.microsoft.com/office/word/2006/wordml" xmlns:wps="http://schemas.microsoft.com/office/word/2010/wordprocessingShape" mc:Ignorable="w14 w15 w16se w16cid w16 w16cex w16sdtdh w16sdtfl w16du wp14">
-  <w:p>
-    <w:pPr>
-      <w:pStyle w:val="Footer"/>
-    </w:pPr>
-  </w:p>
-</w:ftr>
-</file>
-
 <file path=word/footnotes.xml><?xml version="1.0" encoding="utf-8"?>
 <w:footnotes xmlns:wpc="http://schemas.microsoft.com/office/word/2010/wordprocessingCanvas" xmlns:cx="http://schemas.microsoft.com/office/drawing/2014/chartex" xmlns:cx1="http://schemas.microsoft.com/office/drawing/2015/9/8/chartex" xmlns:cx2="http://schemas.microsoft.com/office/drawing/2015/10/21/chartex" xmlns:cx3="http://schemas.microsoft.com/office/drawing/2016/5/9/chartex" xmlns:cx4="http://schemas.microsoft.com/office/drawing/2016/5/10/chartex" xmlns:cx5="http://schemas.microsoft.com/office/drawing/2016/5/11/chartex" xmlns:cx6="http://schemas.microsoft.com/office/drawing/2016/5/12/chartex" xmlns:cx7="http://schemas.microsoft.com/office/drawing/2016/5/13/chartex" xmlns:cx8="http://schemas.microsoft.com/office/drawing/2016/5/14/chartex" xmlns:mc="http://schemas.openxmlformats.org/markup-compatibility/2006" xmlns:aink="http://schemas.microsoft.com/office/drawing/2016/ink" xmlns:am3d="http://schemas.microsoft.com/office/drawing/2017/model3d" xmlns:o="urn:schemas-microsoft-com:office:office" xmlns:oel="http://schemas.microsoft.com/office/2019/extlst" xmlns:r="http://schemas.openxmlformats.org/officeDocument/2006/relationships" xmlns:m="http://schemas.openxmlformats.org/officeDocument/2006/math" xmlns:v="urn:schemas-microsoft-com:vml" xmlns:wp14="http://schemas.microsoft.com/office/word/2010/wordprocessingDrawing" xmlns:wp="http://schemas.openxmlformats.org/drawingml/2006/wordprocessingDrawing" xmlns:w10="urn:schemas-microsoft-com:office:word" xmlns:w="http://schemas.openxmlformats.org/wordprocessingml/2006/main" xmlns:w14="http://schemas.microsoft.com/office/word/2010/wordml" xmlns:w15="http://schemas.microsoft.com/office/word/2012/wordml" xmlns:w16cex="http://schemas.microsoft.com/office/word/2018/wordml/cex" xmlns:w16cid="http://schemas.microsoft.com/office/word/2016/wordml/cid" xmlns:w16="http://schemas.microsoft.com/office/word/2018/wordml" xmlns:w16du="http://schemas.microsoft.com/office/word/2023/wordml/word16du" xmlns:w16sdtdh="http://schemas.microsoft.com/office/word/2020/wordml/sdtdatahash" xmlns:w16sdtfl="http://schemas.microsoft.com/office/word/2024/wordml/sdtformatlock" xmlns:w16se="http://schemas.microsoft.com/office/word/2015/wordml/symex" xmlns:wpg="http://schemas.microsoft.com/office/word/2010/wordprocessingGroup" xmlns:wpi="http://schemas.microsoft.com/office/word/2010/wordprocessingInk" xmlns:wne="http://schemas.microsoft.com/office/word/2006/wordml" xmlns:wps="http://schemas.microsoft.com/office/word/2010/wordprocessingShape" mc:Ignorable="w14 w15 w16se w16cid w16 w16cex w16sdtdh w16sdtfl w16du wp14">
   <w:footnote w:type="separator" w:id="-1">
@@ -1189,16 +1377,6 @@
 </file>
 
 <file path=word/header1.xml><?xml version="1.0" encoding="utf-8"?>
-<w:hdr xmlns:wpc="http://schemas.microsoft.com/office/word/2010/wordprocessingCanvas" xmlns:cx="http://schemas.microsoft.com/office/drawing/2014/chartex" xmlns:cx1="http://schemas.microsoft.com/office/drawing/2015/9/8/chartex" xmlns:cx2="http://schemas.microsoft.com/office/drawing/2015/10/21/chartex" xmlns:cx3="http://schemas.microsoft.com/office/drawing/2016/5/9/chartex" xmlns:cx4="http://schemas.microsoft.com/office/drawing/2016/5/10/chartex" xmlns:cx5="http://schemas.microsoft.com/office/drawing/2016/5/11/chartex" xmlns:cx6="http://schemas.microsoft.com/office/drawing/2016/5/12/chartex" xmlns:cx7="http://schemas.microsoft.com/office/drawing/2016/5/13/chartex" xmlns:cx8="http://schemas.microsoft.com/office/drawing/2016/5/14/chartex" xmlns:mc="http://schemas.openxmlformats.org/markup-compatibility/2006" xmlns:aink="http://schemas.microsoft.com/office/drawing/2016/ink" xmlns:am3d="http://schemas.microsoft.com/office/drawing/2017/model3d" xmlns:o="urn:schemas-microsoft-com:office:office" xmlns:oel="http://schemas.microsoft.com/office/2019/extlst" xmlns:r="http://schemas.openxmlformats.org/officeDocument/2006/relationships" xmlns:m="http://schemas.openxmlformats.org/officeDocument/2006/math" xmlns:v="urn:schemas-microsoft-com:vml" xmlns:wp14="http://schemas.microsoft.com/office/word/2010/wordprocessingDrawing" xmlns:wp="http://schemas.openxmlformats.org/drawingml/2006/wordprocessingDrawing" xmlns:w10="urn:schemas-microsoft-com:office:word" xmlns:w="http://schemas.openxmlformats.org/wordprocessingml/2006/main" xmlns:w14="http://schemas.microsoft.com/office/word/2010/wordml" xmlns:w15="http://schemas.microsoft.com/office/word/2012/wordml" xmlns:w16cex="http://schemas.microsoft.com/office/word/2018/wordml/cex" xmlns:w16cid="http://schemas.microsoft.com/office/word/2016/wordml/cid" xmlns:w16="http://schemas.microsoft.com/office/word/2018/wordml" xmlns:w16du="http://schemas.microsoft.com/office/word/2023/wordml/word16du" xmlns:w16sdtdh="http://schemas.microsoft.com/office/word/2020/wordml/sdtdatahash" xmlns:w16sdtfl="http://schemas.microsoft.com/office/word/2024/wordml/sdtformatlock" xmlns:w16se="http://schemas.microsoft.com/office/word/2015/wordml/symex" xmlns:wpg="http://schemas.microsoft.com/office/word/2010/wordprocessingGroup" xmlns:wpi="http://schemas.microsoft.com/office/word/2010/wordprocessingInk" xmlns:wne="http://schemas.microsoft.com/office/word/2006/wordml" xmlns:wps="http://schemas.microsoft.com/office/word/2010/wordprocessingShape" mc:Ignorable="w14 w15 w16se w16cid w16 w16cex w16sdtdh w16sdtfl w16du wp14">
-  <w:p>
-    <w:pPr>
-      <w:pStyle w:val="Header"/>
-    </w:pPr>
-  </w:p>
-</w:hdr>
-</file>
-
-<file path=word/header2.xml><?xml version="1.0" encoding="utf-8"?>
 <w:hdr xmlns:wpc="http://schemas.microsoft.com/office/word/2010/wordprocessingCanvas" xmlns:cx="http://schemas.microsoft.com/office/drawing/2014/chartex" xmlns:cx1="http://schemas.microsoft.com/office/drawing/2015/9/8/chartex" xmlns:cx2="http://schemas.microsoft.com/office/drawing/2015/10/21/chartex" xmlns:cx3="http://schemas.microsoft.com/office/drawing/2016/5/9/chartex" xmlns:cx4="http://schemas.microsoft.com/office/drawing/2016/5/10/chartex" xmlns:cx5="http://schemas.microsoft.com/office/drawing/2016/5/11/chartex" xmlns:cx6="http://schemas.microsoft.com/office/drawing/2016/5/12/chartex" xmlns:cx7="http://schemas.microsoft.com/office/drawing/2016/5/13/chartex" xmlns:cx8="http://schemas.microsoft.com/office/drawing/2016/5/14/chartex" xmlns:mc="http://schemas.openxmlformats.org/markup-compatibility/2006" xmlns:aink="http://schemas.microsoft.com/office/drawing/2016/ink" xmlns:am3d="http://schemas.microsoft.com/office/drawing/2017/model3d" xmlns:o="urn:schemas-microsoft-com:office:office" xmlns:oel="http://schemas.microsoft.com/office/2019/extlst" xmlns:r="http://schemas.openxmlformats.org/officeDocument/2006/relationships" xmlns:m="http://schemas.openxmlformats.org/officeDocument/2006/math" xmlns:v="urn:schemas-microsoft-com:vml" xmlns:wp14="http://schemas.microsoft.com/office/word/2010/wordprocessingDrawing" xmlns:wp="http://schemas.openxmlformats.org/drawingml/2006/wordprocessingDrawing" xmlns:w10="urn:schemas-microsoft-com:office:word" xmlns:w="http://schemas.openxmlformats.org/wordprocessingml/2006/main" xmlns:w14="http://schemas.microsoft.com/office/word/2010/wordml" xmlns:w15="http://schemas.microsoft.com/office/word/2012/wordml" xmlns:w16cex="http://schemas.microsoft.com/office/word/2018/wordml/cex" xmlns:w16cid="http://schemas.microsoft.com/office/word/2016/wordml/cid" xmlns:w16="http://schemas.microsoft.com/office/word/2018/wordml" xmlns:w16du="http://schemas.microsoft.com/office/word/2023/wordml/word16du" xmlns:w16sdtdh="http://schemas.microsoft.com/office/word/2020/wordml/sdtdatahash" xmlns:w16sdtfl="http://schemas.microsoft.com/office/word/2024/wordml/sdtformatlock" xmlns:w16se="http://schemas.microsoft.com/office/word/2015/wordml/symex" xmlns:wpg="http://schemas.microsoft.com/office/word/2010/wordprocessingGroup" xmlns:wpi="http://schemas.microsoft.com/office/word/2010/wordprocessingInk" xmlns:wne="http://schemas.microsoft.com/office/word/2006/wordml" xmlns:wps="http://schemas.microsoft.com/office/word/2010/wordprocessingShape" mc:Ignorable="w14 w15 w16se w16cid w16 w16cex w16sdtdh w16sdtfl w16du wp14">
   <w:p>
     <w:pPr>
@@ -1544,16 +1722,6 @@
         </mc:Fallback>
       </mc:AlternateContent>
     </w:r>
-  </w:p>
-</w:hdr>
-</file>
-
-<file path=word/header3.xml><?xml version="1.0" encoding="utf-8"?>
-<w:hdr xmlns:wpc="http://schemas.microsoft.com/office/word/2010/wordprocessingCanvas" xmlns:cx="http://schemas.microsoft.com/office/drawing/2014/chartex" xmlns:cx1="http://schemas.microsoft.com/office/drawing/2015/9/8/chartex" xmlns:cx2="http://schemas.microsoft.com/office/drawing/2015/10/21/chartex" xmlns:cx3="http://schemas.microsoft.com/office/drawing/2016/5/9/chartex" xmlns:cx4="http://schemas.microsoft.com/office/drawing/2016/5/10/chartex" xmlns:cx5="http://schemas.microsoft.com/office/drawing/2016/5/11/chartex" xmlns:cx6="http://schemas.microsoft.com/office/drawing/2016/5/12/chartex" xmlns:cx7="http://schemas.microsoft.com/office/drawing/2016/5/13/chartex" xmlns:cx8="http://schemas.microsoft.com/office/drawing/2016/5/14/chartex" xmlns:mc="http://schemas.openxmlformats.org/markup-compatibility/2006" xmlns:aink="http://schemas.microsoft.com/office/drawing/2016/ink" xmlns:am3d="http://schemas.microsoft.com/office/drawing/2017/model3d" xmlns:o="urn:schemas-microsoft-com:office:office" xmlns:oel="http://schemas.microsoft.com/office/2019/extlst" xmlns:r="http://schemas.openxmlformats.org/officeDocument/2006/relationships" xmlns:m="http://schemas.openxmlformats.org/officeDocument/2006/math" xmlns:v="urn:schemas-microsoft-com:vml" xmlns:wp14="http://schemas.microsoft.com/office/word/2010/wordprocessingDrawing" xmlns:wp="http://schemas.openxmlformats.org/drawingml/2006/wordprocessingDrawing" xmlns:w10="urn:schemas-microsoft-com:office:word" xmlns:w="http://schemas.openxmlformats.org/wordprocessingml/2006/main" xmlns:w14="http://schemas.microsoft.com/office/word/2010/wordml" xmlns:w15="http://schemas.microsoft.com/office/word/2012/wordml" xmlns:w16cex="http://schemas.microsoft.com/office/word/2018/wordml/cex" xmlns:w16cid="http://schemas.microsoft.com/office/word/2016/wordml/cid" xmlns:w16="http://schemas.microsoft.com/office/word/2018/wordml" xmlns:w16du="http://schemas.microsoft.com/office/word/2023/wordml/word16du" xmlns:w16sdtdh="http://schemas.microsoft.com/office/word/2020/wordml/sdtdatahash" xmlns:w16sdtfl="http://schemas.microsoft.com/office/word/2024/wordml/sdtformatlock" xmlns:w16se="http://schemas.microsoft.com/office/word/2015/wordml/symex" xmlns:wpg="http://schemas.microsoft.com/office/word/2010/wordprocessingGroup" xmlns:wpi="http://schemas.microsoft.com/office/word/2010/wordprocessingInk" xmlns:wne="http://schemas.microsoft.com/office/word/2006/wordml" xmlns:wps="http://schemas.microsoft.com/office/word/2010/wordprocessingShape" mc:Ignorable="w14 w15 w16se w16cid w16 w16cex w16sdtdh w16sdtfl w16du wp14">
-  <w:p>
-    <w:pPr>
-      <w:pStyle w:val="Header"/>
-    </w:pPr>
   </w:p>
 </w:hdr>
 </file>
@@ -3433,9 +3601,13 @@
   <w:rsids>
     <w:rsidRoot w:val="0000471B"/>
     <w:rsid w:val="0000471B"/>
+    <w:rsid w:val="00162EAB"/>
+    <w:rsid w:val="00427A86"/>
     <w:rsid w:val="005B59AC"/>
     <w:rsid w:val="00624E10"/>
+    <w:rsid w:val="00717629"/>
     <w:rsid w:val="00971230"/>
+    <w:rsid w:val="009C049B"/>
     <w:rsid w:val="009F51D0"/>
     <w:rsid w:val="00BD440D"/>
     <w:rsid w:val="00C435D1"/>
@@ -4430,24 +4602,6 @@
 </file>
 
 <file path=customXml/item1.xml><?xml version="1.0" encoding="utf-8"?>
-<p:properties xmlns:p="http://schemas.microsoft.com/office/2006/metadata/properties" xmlns:xsi="http://www.w3.org/2001/XMLSchema-instance" xmlns:pc="http://schemas.microsoft.com/office/infopath/2007/PartnerControls">
-  <documentManagement>
-    <_ip_UnifiedCompliancePolicyUIAction xmlns="http://schemas.microsoft.com/sharepoint/v3" xsi:nil="true"/>
-    <_ip_UnifiedCompliancePolicyProperties xmlns="http://schemas.microsoft.com/sharepoint/v3" xsi:nil="true"/>
-  </documentManagement>
-</p:properties>
-</file>
-
-<file path=customXml/item2.xml><?xml version="1.0" encoding="utf-8"?>
-<?mso-contentType ?>
-<FormTemplates xmlns="http://schemas.microsoft.com/sharepoint/v3/contenttype/forms">
-  <Display>DocumentLibraryForm</Display>
-  <Edit>DocumentLibraryForm</Edit>
-  <New>DocumentLibraryForm</New>
-</FormTemplates>
-</file>
-
-<file path=customXml/item3.xml><?xml version="1.0" encoding="utf-8"?>
 <ct:contentTypeSchema xmlns:ct="http://schemas.microsoft.com/office/2006/metadata/contentType" xmlns:ma="http://schemas.microsoft.com/office/2006/metadata/properties/metaAttributes" ct:_="" ma:_="" ma:contentTypeName="Document" ma:contentTypeID="0x010100DEEA25CC0A0AC24199CDC46C25B8B0BC" ma:contentTypeVersion="10" ma:contentTypeDescription="Create a new document." ma:contentTypeScope="" ma:versionID="e3b47856d4cf355c0dacb39e1084d14f">
   <xsd:schema xmlns:xsd="http://www.w3.org/2001/XMLSchema" xmlns:xs="http://www.w3.org/2001/XMLSchema" xmlns:p="http://schemas.microsoft.com/office/2006/metadata/properties" xmlns:ns1="http://schemas.microsoft.com/sharepoint/v3" xmlns:ns2="6dc4bcd6-49db-4c07-9060-8acfc67cef9f" xmlns:ns3="fb0879af-3eba-417a-a55a-ffe6dcd6ca77" targetNamespace="http://schemas.microsoft.com/office/2006/metadata/properties" ma:root="true" ma:fieldsID="a845a615265fdb1f7b12cc65ac20ecbd" ns1:_="" ns2:_="" ns3:_="">
     <xsd:import namespace="http://schemas.microsoft.com/sharepoint/v3"/>
@@ -4655,29 +4809,29 @@
 </ct:contentTypeSchema>
 </file>
 
-<file path=customXml/item4.xml><?xml version="1.0" encoding="utf-8"?>
+<file path=customXml/item2.xml><?xml version="1.0" encoding="utf-8"?>
 <b:Sources xmlns:b="http://schemas.openxmlformats.org/officeDocument/2006/bibliography" xmlns="http://schemas.openxmlformats.org/officeDocument/2006/bibliography" SelectedStyle="/APASixthEditionOfficeOnline.xsl" StyleName="APA"/>
 </file>
 
-<file path=customXml/itemProps1.xml><?xml version="1.0" encoding="utf-8"?>
-<ds:datastoreItem xmlns:ds="http://schemas.openxmlformats.org/officeDocument/2006/customXml" ds:itemID="{63736847-D2B4-41BF-91C7-3AE2A8FBC59E}">
-  <ds:schemaRefs>
-    <ds:schemaRef ds:uri="http://schemas.microsoft.com/office/2006/metadata/properties"/>
-    <ds:schemaRef ds:uri="http://schemas.microsoft.com/office/infopath/2007/PartnerControls"/>
-    <ds:schemaRef ds:uri="http://schemas.microsoft.com/sharepoint/v3"/>
-  </ds:schemaRefs>
-</ds:datastoreItem>
+<file path=customXml/item3.xml><?xml version="1.0" encoding="utf-8"?>
+<p:properties xmlns:p="http://schemas.microsoft.com/office/2006/metadata/properties" xmlns:xsi="http://www.w3.org/2001/XMLSchema-instance" xmlns:pc="http://schemas.microsoft.com/office/infopath/2007/PartnerControls">
+  <documentManagement>
+    <_ip_UnifiedCompliancePolicyUIAction xmlns="http://schemas.microsoft.com/sharepoint/v3" xsi:nil="true"/>
+    <_ip_UnifiedCompliancePolicyProperties xmlns="http://schemas.microsoft.com/sharepoint/v3" xsi:nil="true"/>
+  </documentManagement>
+</p:properties>
 </file>
 
-<file path=customXml/itemProps2.xml><?xml version="1.0" encoding="utf-8"?>
-<ds:datastoreItem xmlns:ds="http://schemas.openxmlformats.org/officeDocument/2006/customXml" ds:itemID="{C179D0FB-A343-4575-8D55-CC3417BBF60A}">
-  <ds:schemaRefs>
-    <ds:schemaRef ds:uri="http://schemas.microsoft.com/sharepoint/v3/contenttype/forms"/>
-  </ds:schemaRefs>
-</ds:datastoreItem>
+<file path=customXml/item4.xml><?xml version="1.0" encoding="utf-8"?>
+<?mso-contentType ?>
+<FormTemplates xmlns="http://schemas.microsoft.com/sharepoint/v3/contenttype/forms">
+  <Display>DocumentLibraryForm</Display>
+  <Edit>DocumentLibraryForm</Edit>
+  <New>DocumentLibraryForm</New>
+</FormTemplates>
 </file>
 
-<file path=customXml/itemProps3.xml><?xml version="1.0" encoding="utf-8"?>
+<file path=customXml/itemProps1.xml><?xml version="1.0" encoding="utf-8"?>
 <ds:datastoreItem xmlns:ds="http://schemas.openxmlformats.org/officeDocument/2006/customXml" ds:itemID="{1521F6B9-1CE3-4ED3-8390-A0700A8F70A0}">
   <ds:schemaRefs>
     <ds:schemaRef ds:uri="http://schemas.microsoft.com/office/2006/metadata/contentType"/>
@@ -4697,10 +4851,28 @@
 </ds:datastoreItem>
 </file>
 
-<file path=customXml/itemProps4.xml><?xml version="1.0" encoding="utf-8"?>
+<file path=customXml/itemProps2.xml><?xml version="1.0" encoding="utf-8"?>
 <ds:datastoreItem xmlns:ds="http://schemas.openxmlformats.org/officeDocument/2006/customXml" ds:itemID="{902E34AE-1782-4376-B2CF-BBC5B536851C}">
   <ds:schemaRefs>
     <ds:schemaRef ds:uri="http://schemas.openxmlformats.org/officeDocument/2006/bibliography"/>
   </ds:schemaRefs>
 </ds:datastoreItem>
+</file>
+
+<file path=customXml/itemProps3.xml><?xml version="1.0" encoding="utf-8"?>
+<ds:datastoreItem xmlns:ds="http://schemas.openxmlformats.org/officeDocument/2006/customXml" ds:itemID="{63736847-D2B4-41BF-91C7-3AE2A8FBC59E}">
+  <ds:schemaRefs>
+    <ds:schemaRef ds:uri="http://schemas.microsoft.com/office/2006/metadata/properties"/>
+    <ds:schemaRef ds:uri="http://schemas.microsoft.com/office/infopath/2007/PartnerControls"/>
+    <ds:schemaRef ds:uri="http://schemas.microsoft.com/sharepoint/v3"/>
+  </ds:schemaRefs>
+</ds:datastoreItem>
+</file>
+
+<file path=customXml/itemProps4.xml><?xml version="1.0" encoding="utf-8"?>
+<ds:datastoreItem xmlns:ds="http://schemas.openxmlformats.org/officeDocument/2006/customXml" ds:itemID="{C179D0FB-A343-4575-8D55-CC3417BBF60A}">
+  <ds:schemaRefs>
+    <ds:schemaRef ds:uri="http://schemas.microsoft.com/sharepoint/v3/contenttype/forms"/>
+  </ds:schemaRefs>
+</ds:datastoreItem>
 </file>
</xml_diff>